<commit_message>
feat: AskBar (prompt→suggested columns), CSV/JSON export, activity indicator, 4 multi-issuer demo PDFs
</commit_message>
<xml_diff>
--- a/samples/matrix_status_update.docx
+++ b/samples/matrix_status_update.docx
@@ -161,55 +161,6 @@
       </w:pPr>
       <w:r>
         <w:t>On the ask questions about your data framework. That is exactly the per cell ISD agent. It is live, streaming state through server sent events, with citations that open the source PDF in a pane on the right side of the screen. A FinanceBench benchmark harness runs all three retriever modes against the same questions and emits a markdown comparison table with correctness, citation page recall, citation precision, latency, and token cost per question.</w:t>
-      </w:r>
-    </w:p>
-    <w:p>
-      <w:pPr>
-        <w:spacing w:before="200" w:after="80"/>
-      </w:pPr>
-      <w:r>
-        <w:rPr>
-          <w:b/>
-          <w:color w:val="1E3A5F"/>
-          <w:sz w:val="26"/>
-        </w:rPr>
-        <w:t>4. Current state</w:t>
-      </w:r>
-    </w:p>
-    <w:p>
-      <w:pPr>
-        <w:pStyle w:val="ListBullet"/>
-        <w:spacing w:after="40"/>
-      </w:pPr>
-      <w:r>
-        <w:t>Twenty three backend tests passing. Frontend type check clean.</w:t>
-      </w:r>
-    </w:p>
-    <w:p>
-      <w:pPr>
-        <w:pStyle w:val="ListBullet"/>
-        <w:spacing w:after="40"/>
-      </w:pPr>
-      <w:r>
-        <w:t>End to end demo working on a sample ten K with real answers and citations that highlight the bounding box on the PDF page.</w:t>
-      </w:r>
-    </w:p>
-    <w:p>
-      <w:pPr>
-        <w:pStyle w:val="ListBullet"/>
-        <w:spacing w:after="40"/>
-      </w:pPr>
-      <w:r>
-        <w:t>FinanceBench harness plugs in with one command and produces a per mode report.</w:t>
-      </w:r>
-    </w:p>
-    <w:p>
-      <w:pPr>
-        <w:pStyle w:val="ListBullet"/>
-        <w:spacing w:after="40"/>
-      </w:pPr>
-      <w:r>
-        <w:t>SQLite database with WAL mode, LanceDB vector index, gzipped per cell traces, content addressable PDF storage.</w:t>
       </w:r>
     </w:p>
     <w:sectPr>

</xml_diff>